<commit_message>
Actualizacion hasta Unidades 3/4
</commit_message>
<xml_diff>
--- a/Carrera Sistemas/Materias/2-SegundoAño/11507 - Introduccion a las Bases de Datos - Perez/Actividades Introducción a Bases de Datos.docx
+++ b/Carrera Sistemas/Materias/2-SegundoAño/11507 - Introduccion a las Bases de Datos - Perez/Actividades Introducción a Bases de Datos.docx
@@ -3031,25 +3031,7 @@
         <w:rPr>
           <w:color w:val="000000"/>
         </w:rPr>
-        <w:t xml:space="preserve"> </w:t>
-      </w:r>
-      <w:r>
-        <w:rPr>
-          <w:color w:val="000000"/>
-        </w:rPr>
-        <w:t>(</w:t>
-      </w:r>
-      <w:r>
-        <w:rPr>
-          <w:color w:val="000000"/>
-        </w:rPr>
-        <w:t>Relación</w:t>
-      </w:r>
-      <w:r>
-        <w:rPr>
-          <w:color w:val="000000"/>
-        </w:rPr>
-        <w:t xml:space="preserve"> con Paciente)</w:t>
+        <w:t xml:space="preserve"> (Relación con Paciente)</w:t>
       </w:r>
     </w:p>
     <w:p>
@@ -3115,37 +3097,7 @@
         <w:rPr>
           <w:color w:val="000000"/>
         </w:rPr>
-        <w:t xml:space="preserve"> </w:t>
-      </w:r>
-      <w:r>
-        <w:rPr>
-          <w:color w:val="000000"/>
-        </w:rPr>
-        <w:t>(</w:t>
-      </w:r>
-      <w:r>
-        <w:rPr>
-          <w:color w:val="000000"/>
-        </w:rPr>
-        <w:t>Relación</w:t>
-      </w:r>
-      <w:r>
-        <w:rPr>
-          <w:color w:val="000000"/>
-        </w:rPr>
-        <w:t xml:space="preserve"> con </w:t>
-      </w:r>
-      <w:r>
-        <w:rPr>
-          <w:color w:val="000000"/>
-        </w:rPr>
-        <w:t>Odontólogo</w:t>
-      </w:r>
-      <w:r>
-        <w:rPr>
-          <w:color w:val="000000"/>
-        </w:rPr>
-        <w:t>)</w:t>
+        <w:t xml:space="preserve"> (Relación con Odontólogo)</w:t>
       </w:r>
     </w:p>
     <w:p>
@@ -3175,13 +3127,7 @@
         <w:rPr>
           <w:color w:val="000000"/>
         </w:rPr>
-        <w:t xml:space="preserve"> </w:t>
-      </w:r>
-      <w:r>
-        <w:rPr>
-          <w:color w:val="000000"/>
-        </w:rPr>
-        <w:t>(Relación con Odontólogo)</w:t>
+        <w:t xml:space="preserve"> (Relación con Odontólogo)</w:t>
       </w:r>
     </w:p>
     <w:p>
@@ -3327,13 +3273,7 @@
         <w:jc w:val="both"/>
       </w:pPr>
       <w:r>
-        <w:t>Posee registros</w:t>
-      </w:r>
-      <w:r>
-        <w:t xml:space="preserve"> -&gt; </w:t>
-      </w:r>
-      <w:r>
-        <w:t>Odontólogos</w:t>
+        <w:t>Posee registros -&gt; Odontólogos</w:t>
       </w:r>
     </w:p>
     <w:p>
@@ -3388,10 +3328,7 @@
         <w:jc w:val="both"/>
       </w:pPr>
       <w:r>
-        <w:t xml:space="preserve">Asociados a -&gt; </w:t>
-      </w:r>
-      <w:r>
-        <w:t>Odontólogos</w:t>
+        <w:t>Asociados a -&gt; Odontólogos</w:t>
       </w:r>
     </w:p>
     <w:p>
@@ -3929,13 +3866,7 @@
         <w:rPr>
           <w:color w:val="000000"/>
         </w:rPr>
-        <w:t xml:space="preserve">ID Venta </w:t>
-      </w:r>
-      <w:r>
-        <w:rPr>
-          <w:color w:val="000000"/>
-        </w:rPr>
-        <w:t>(Clave primaria)</w:t>
+        <w:t>ID Venta (Clave primaria)</w:t>
       </w:r>
     </w:p>
     <w:p>
@@ -4344,13 +4275,7 @@
         <w:rPr>
           <w:color w:val="000000"/>
         </w:rPr>
-        <w:t xml:space="preserve"> </w:t>
-      </w:r>
-      <w:r>
-        <w:rPr>
-          <w:color w:val="000000"/>
-        </w:rPr>
-        <w:t>(Clave primaria)</w:t>
+        <w:t xml:space="preserve"> (Clave primaria)</w:t>
       </w:r>
     </w:p>
     <w:p>
@@ -4454,13 +4379,7 @@
         <w:rPr>
           <w:color w:val="000000"/>
         </w:rPr>
-        <w:t xml:space="preserve"> </w:t>
-      </w:r>
-      <w:r>
-        <w:rPr>
-          <w:color w:val="000000"/>
-        </w:rPr>
-        <w:t>(Clave Primaria)</w:t>
+        <w:t xml:space="preserve"> (Clave Primaria)</w:t>
       </w:r>
     </w:p>
     <w:p>
@@ -5023,16 +4942,23 @@
         <w:pStyle w:val="Ttulo2"/>
         <w:widowControl w:val="0"/>
         <w:spacing w:before="0" w:line="240" w:lineRule="auto"/>
+        <w:rPr>
+          <w:highlight w:val="yellow"/>
+        </w:rPr>
       </w:pPr>
       <w:bookmarkStart w:id="7" w:name="_bcqa35pdx0z8" w:colFirst="0" w:colLast="0"/>
       <w:bookmarkEnd w:id="7"/>
       <w:r>
         <w:rPr>
+          <w:highlight w:val="yellow"/>
           <w:u w:val="single"/>
         </w:rPr>
         <w:t>Actividad 03</w:t>
       </w:r>
       <w:r>
+        <w:rPr>
+          <w:highlight w:val="yellow"/>
+        </w:rPr>
         <w:t xml:space="preserve"> </w:t>
       </w:r>
     </w:p>
@@ -5042,18 +4968,28 @@
         <w:spacing w:before="283" w:line="245" w:lineRule="auto"/>
         <w:ind w:left="15" w:right="795"/>
         <w:jc w:val="both"/>
-      </w:pPr>
-      <w:r>
+        <w:rPr>
+          <w:highlight w:val="yellow"/>
+        </w:rPr>
+      </w:pPr>
+      <w:r>
+        <w:rPr>
+          <w:highlight w:val="yellow"/>
+        </w:rPr>
         <w:t xml:space="preserve">Para realizar la presente actividad se deberá leer el apunte teórico de la </w:t>
       </w:r>
       <w:proofErr w:type="gramStart"/>
       <w:r>
+        <w:rPr>
+          <w:highlight w:val="yellow"/>
+        </w:rPr>
         <w:t xml:space="preserve">materia </w:t>
       </w:r>
       <w:r>
         <w:rPr>
           <w:b/>
           <w:bCs/>
+          <w:highlight w:val="yellow"/>
         </w:rPr>
         <w:t xml:space="preserve"> “</w:t>
       </w:r>
@@ -5062,10 +4998,14 @@
         <w:rPr>
           <w:b/>
           <w:bCs/>
+          <w:highlight w:val="yellow"/>
         </w:rPr>
         <w:t>1 - Modelo Entidad-Relación. Elementos de diseño y Diagrama Conceptual”</w:t>
       </w:r>
       <w:r>
+        <w:rPr>
+          <w:highlight w:val="yellow"/>
+        </w:rPr>
         <w:t xml:space="preserve"> y realizar las siguientes actividades: </w:t>
       </w:r>
     </w:p>
@@ -5075,8 +5015,14 @@
         <w:spacing w:before="278" w:line="272" w:lineRule="auto"/>
         <w:ind w:right="590" w:firstLine="22"/>
         <w:jc w:val="both"/>
-      </w:pPr>
-      <w:r>
+        <w:rPr>
+          <w:highlight w:val="yellow"/>
+        </w:rPr>
+      </w:pPr>
+      <w:r>
+        <w:rPr>
+          <w:highlight w:val="yellow"/>
+        </w:rPr>
         <w:t xml:space="preserve">1- Elaborar el diagrama el diagrama conceptual (DC) del apunte, referido al enunciado 1 de la actividad 02 (consultorio odontológico) completo, agregando las entidades y relaciones faltantes. </w:t>
       </w:r>
     </w:p>
@@ -5086,8 +5032,14 @@
         <w:spacing w:before="313" w:line="240" w:lineRule="auto"/>
         <w:ind w:left="4"/>
         <w:jc w:val="both"/>
-      </w:pPr>
-      <w:r>
+        <w:rPr>
+          <w:highlight w:val="yellow"/>
+        </w:rPr>
+      </w:pPr>
+      <w:r>
+        <w:rPr>
+          <w:highlight w:val="yellow"/>
+        </w:rPr>
         <w:t xml:space="preserve">2- Crear el DC del enunciado 2 de la actividad 2 (farmacia). </w:t>
       </w:r>
     </w:p>
@@ -5099,7 +5051,13 @@
         <w:jc w:val="both"/>
       </w:pPr>
       <w:r>
-        <w:t xml:space="preserve">La entrega se realizará en formato Dia o en formato de imagen con el SW que deseen. </w:t>
+        <w:rPr>
+          <w:highlight w:val="yellow"/>
+        </w:rPr>
+        <w:t>La entrega se realizará en formato Dia o en formato de imagen con el SW que deseen.</w:t>
+      </w:r>
+      <w:r>
+        <w:t xml:space="preserve"> </w:t>
       </w:r>
     </w:p>
     <w:p>
@@ -5147,15 +5105,7 @@
         <w:jc w:val="both"/>
       </w:pPr>
       <w:r>
-        <w:t xml:space="preserve">La empresa cuenta con aviones de los que se conoce su marca, modelo, matrícula y fecha de </w:t>
-      </w:r>
-      <w:proofErr w:type="gramStart"/>
-      <w:r>
-        <w:t>entrada</w:t>
-      </w:r>
-      <w:proofErr w:type="gramEnd"/>
-      <w:r>
-        <w:t xml:space="preserve"> en servicio. De la marca del avión se conoce un código, el nombre y el país de origen. </w:t>
+        <w:t xml:space="preserve">La empresa cuenta con aviones de los que se conoce su marca, modelo, matrícula y fecha de entrada en servicio. De la marca del avión se conoce un código, el nombre y el país de origen. </w:t>
       </w:r>
     </w:p>
     <w:p>

</xml_diff>

<commit_message>
Actualizacion hasta unidad 4/5
</commit_message>
<xml_diff>
--- a/Carrera Sistemas/Materias/2-SegundoAño/11507 - Introduccion a las Bases de Datos - Perez/Actividades Introducción a Bases de Datos.docx
+++ b/Carrera Sistemas/Materias/2-SegundoAño/11507 - Introduccion a las Bases de Datos - Perez/Actividades Introducción a Bases de Datos.docx
@@ -49,7 +49,7 @@
             <wp:extent cx="1161012" cy="1277113"/>
             <wp:effectExtent l="0" t="0" r="0" b="0"/>
             <wp:wrapSquare wrapText="left" distT="19050" distB="19050" distL="19050" distR="19050"/>
-            <wp:docPr id="1" name="image1.png"/>
+            <wp:docPr id="1" name="Imagen 1"/>
             <wp:cNvGraphicFramePr/>
             <a:graphic xmlns:a="http://schemas.openxmlformats.org/drawingml/2006/main">
               <a:graphicData uri="http://schemas.openxmlformats.org/drawingml/2006/picture">
@@ -215,18 +215,38 @@
         </w:rPr>
         <w:t xml:space="preserve">Slack: </w:t>
       </w:r>
-      <w:hyperlink r:id="rId8">
-        <w:r>
-          <w:rPr>
-            <w:color w:val="51666C"/>
-            <w:sz w:val="15"/>
-            <w:szCs w:val="15"/>
-            <w:highlight w:val="white"/>
-            <w:lang w:val="en-GB"/>
-          </w:rPr>
-          <w:t>https://join.slack.com/t/unlaintroducc-h043173/shared_invite/zt-2f6q5j66t-mogSZ1wXc7qWGOp72FWgsg</w:t>
-        </w:r>
-      </w:hyperlink>
+      <w:r>
+        <w:fldChar w:fldCharType="begin"/>
+      </w:r>
+      <w:r>
+        <w:rPr>
+          <w:lang w:val="en-GB"/>
+        </w:rPr>
+        <w:instrText>HYPERLINK "https://join.slack.com/t/unlaintroducc-h043173/shared_invite/zt-2f6q5j66t-mogSZ1wXc7qWGOp72FWgsg" \h</w:instrText>
+      </w:r>
+      <w:r>
+        <w:fldChar w:fldCharType="separate"/>
+      </w:r>
+      <w:r>
+        <w:rPr>
+          <w:color w:val="51666C"/>
+          <w:sz w:val="15"/>
+          <w:szCs w:val="15"/>
+          <w:highlight w:val="white"/>
+          <w:lang w:val="en-GB"/>
+        </w:rPr>
+        <w:t>https://join.slack.com/t/unlaintroducc-h043173/shared_invite/zt-2f6q5j66t-mogSZ1wXc7qWGOp72FWgsg</w:t>
+      </w:r>
+      <w:r>
+        <w:rPr>
+          <w:color w:val="51666C"/>
+          <w:sz w:val="15"/>
+          <w:szCs w:val="15"/>
+          <w:highlight w:val="white"/>
+          <w:lang w:val="en-GB"/>
+        </w:rPr>
+        <w:fldChar w:fldCharType="end"/>
+      </w:r>
     </w:p>
     <w:p>
       <w:pPr>
@@ -304,7 +324,7 @@
         </w:rPr>
         <w:t xml:space="preserve"> </w:t>
       </w:r>
-      <w:hyperlink r:id="rId9">
+      <w:hyperlink r:id="rId8">
         <w:r>
           <w:rPr>
             <w:color w:val="1D2125"/>
@@ -360,7 +380,7 @@
         </w:rPr>
         <w:t xml:space="preserve">  </w:t>
       </w:r>
-      <w:hyperlink r:id="rId10">
+      <w:hyperlink r:id="rId9">
         <w:r>
           <w:rPr>
             <w:color w:val="51666C"/>
@@ -451,7 +471,7 @@
         </w:rPr>
         <w:t xml:space="preserve">: </w:t>
       </w:r>
-      <w:hyperlink r:id="rId11">
+      <w:hyperlink r:id="rId10">
         <w:r>
           <w:rPr>
             <w:color w:val="1155CC"/>
@@ -5065,16 +5085,23 @@
         <w:pStyle w:val="Ttulo2"/>
         <w:widowControl w:val="0"/>
         <w:spacing w:line="240" w:lineRule="auto"/>
+        <w:rPr>
+          <w:highlight w:val="yellow"/>
+        </w:rPr>
       </w:pPr>
       <w:bookmarkStart w:id="8" w:name="_ewm046dhfcj4" w:colFirst="0" w:colLast="0"/>
       <w:bookmarkEnd w:id="8"/>
       <w:r>
         <w:rPr>
+          <w:highlight w:val="yellow"/>
           <w:u w:val="single"/>
         </w:rPr>
         <w:t>Actividad 04</w:t>
       </w:r>
       <w:r>
+        <w:rPr>
+          <w:highlight w:val="yellow"/>
+        </w:rPr>
         <w:t xml:space="preserve"> </w:t>
       </w:r>
     </w:p>
@@ -5084,16 +5111,28 @@
         <w:spacing w:before="553" w:line="245" w:lineRule="auto"/>
         <w:ind w:left="7" w:right="487" w:firstLine="9"/>
         <w:jc w:val="both"/>
-      </w:pPr>
-      <w:r>
+        <w:rPr>
+          <w:highlight w:val="yellow"/>
+        </w:rPr>
+      </w:pPr>
+      <w:r>
+        <w:rPr>
+          <w:highlight w:val="yellow"/>
+        </w:rPr>
         <w:t xml:space="preserve">Una empresa de vuelos </w:t>
       </w:r>
       <w:proofErr w:type="spellStart"/>
       <w:r>
+        <w:rPr>
+          <w:highlight w:val="yellow"/>
+        </w:rPr>
         <w:t>charter</w:t>
       </w:r>
       <w:proofErr w:type="spellEnd"/>
       <w:r>
+        <w:rPr>
+          <w:highlight w:val="yellow"/>
+        </w:rPr>
         <w:t xml:space="preserve"> nos pide que hagamos el análisis de su negocio con miras de informatizarlo en el futuro. A tal fin, hemos relevado la siguiente información: </w:t>
       </w:r>
     </w:p>
@@ -5103,8 +5142,14 @@
         <w:spacing w:before="278" w:line="245" w:lineRule="auto"/>
         <w:ind w:left="7" w:right="477" w:firstLine="8"/>
         <w:jc w:val="both"/>
-      </w:pPr>
-      <w:r>
+        <w:rPr>
+          <w:highlight w:val="yellow"/>
+        </w:rPr>
+      </w:pPr>
+      <w:r>
+        <w:rPr>
+          <w:highlight w:val="yellow"/>
+        </w:rPr>
         <w:t xml:space="preserve">La empresa cuenta con aviones de los que se conoce su marca, modelo, matrícula y fecha de entrada en servicio. De la marca del avión se conoce un código, el nombre y el país de origen. </w:t>
       </w:r>
     </w:p>
@@ -5114,8 +5159,14 @@
         <w:spacing w:before="8" w:line="245" w:lineRule="auto"/>
         <w:ind w:left="7" w:right="482" w:firstLine="9"/>
         <w:jc w:val="both"/>
-      </w:pPr>
-      <w:r>
+        <w:rPr>
+          <w:highlight w:val="yellow"/>
+        </w:rPr>
+      </w:pPr>
+      <w:r>
+        <w:rPr>
+          <w:highlight w:val="yellow"/>
+        </w:rPr>
         <w:t xml:space="preserve">De los pilotos de la compañía se registra su apellido, nombre, DNI, CUIL, fecha de ingreso y domicilio (calle, número, localidad, provincia) </w:t>
       </w:r>
     </w:p>
@@ -5125,16 +5176,28 @@
         <w:spacing w:before="8" w:line="245" w:lineRule="auto"/>
         <w:ind w:right="477" w:firstLine="16"/>
         <w:jc w:val="both"/>
-      </w:pPr>
-      <w:r>
+        <w:rPr>
+          <w:highlight w:val="yellow"/>
+        </w:rPr>
+      </w:pPr>
+      <w:r>
+        <w:rPr>
+          <w:highlight w:val="yellow"/>
+        </w:rPr>
         <w:t xml:space="preserve">De los vuelos realizados, se registra el código del mismo (alfanumérico, por </w:t>
       </w:r>
       <w:proofErr w:type="gramStart"/>
       <w:r>
+        <w:rPr>
+          <w:highlight w:val="yellow"/>
+        </w:rPr>
         <w:t>ejemplo</w:t>
       </w:r>
       <w:proofErr w:type="gramEnd"/>
       <w:r>
+        <w:rPr>
+          <w:highlight w:val="yellow"/>
+        </w:rPr>
         <w:t xml:space="preserve"> AR1234) avión que lo realizó, piloto, aeropuerto de origen, aeropuerto de destino, fecha y hora de partida, fecha y hora de arribo, distancia recorrida y el listado de pasajeros del mismo. De los pasajeros se conoce el nombre, apellido, domicilio (calle, número, provincia, localidad), DNI y si participa del programa de viajeros frecuentes de la compañía. </w:t>
       </w:r>
     </w:p>
@@ -5144,8 +5207,14 @@
         <w:spacing w:before="8" w:line="245" w:lineRule="auto"/>
         <w:ind w:left="8" w:right="482" w:firstLine="8"/>
         <w:jc w:val="both"/>
-      </w:pPr>
-      <w:r>
+        <w:rPr>
+          <w:highlight w:val="yellow"/>
+        </w:rPr>
+      </w:pPr>
+      <w:r>
+        <w:rPr>
+          <w:highlight w:val="yellow"/>
+        </w:rPr>
         <w:t xml:space="preserve">De los aeropuertos se conoce el código IATA, el nombre del mismo y la ciudad en la que se encuentra. </w:t>
       </w:r>
     </w:p>
@@ -5155,15 +5224,22 @@
         <w:spacing w:before="308" w:line="240" w:lineRule="auto"/>
         <w:ind w:left="9"/>
         <w:jc w:val="both"/>
+        <w:rPr>
+          <w:highlight w:val="yellow"/>
+        </w:rPr>
       </w:pPr>
       <w:r>
         <w:rPr>
           <w:b/>
           <w:bCs/>
+          <w:highlight w:val="yellow"/>
         </w:rPr>
         <w:t>Se pide:</w:t>
       </w:r>
       <w:r>
+        <w:rPr>
+          <w:highlight w:val="yellow"/>
+        </w:rPr>
         <w:t xml:space="preserve"> </w:t>
       </w:r>
     </w:p>
@@ -5173,11 +5249,20 @@
         <w:spacing w:before="43" w:line="272" w:lineRule="auto"/>
         <w:ind w:left="734" w:right="824" w:hanging="367"/>
         <w:jc w:val="both"/>
-      </w:pPr>
-      <w:r>
+        <w:rPr>
+          <w:highlight w:val="yellow"/>
+        </w:rPr>
+      </w:pPr>
+      <w:r>
+        <w:rPr>
+          <w:highlight w:val="yellow"/>
+        </w:rPr>
         <w:t xml:space="preserve">- </w:t>
       </w:r>
       <w:r>
+        <w:rPr>
+          <w:highlight w:val="yellow"/>
+        </w:rPr>
         <w:tab/>
         <w:t xml:space="preserve">Identificar las entidades participantes, sus claves candidatas y primarias y sus relaciones. </w:t>
       </w:r>
@@ -5188,12 +5273,21 @@
         <w:spacing w:before="43" w:line="272" w:lineRule="auto"/>
         <w:ind w:left="734" w:right="824" w:hanging="367"/>
         <w:jc w:val="both"/>
-      </w:pPr>
-      <w:r>
+        <w:rPr>
+          <w:highlight w:val="yellow"/>
+        </w:rPr>
+      </w:pPr>
+      <w:r>
+        <w:rPr>
+          <w:highlight w:val="yellow"/>
+        </w:rPr>
         <w:lastRenderedPageBreak/>
         <w:t xml:space="preserve">- </w:t>
       </w:r>
       <w:r>
+        <w:rPr>
+          <w:highlight w:val="yellow"/>
+        </w:rPr>
         <w:tab/>
         <w:t xml:space="preserve">Definir claves sintéticas sólo en caso que se considere absolutamente necesario. </w:t>
       </w:r>
@@ -5204,11 +5298,20 @@
         <w:spacing w:before="13" w:line="240" w:lineRule="auto"/>
         <w:ind w:left="367"/>
         <w:jc w:val="both"/>
-      </w:pPr>
-      <w:r>
+        <w:rPr>
+          <w:highlight w:val="yellow"/>
+        </w:rPr>
+      </w:pPr>
+      <w:r>
+        <w:rPr>
+          <w:highlight w:val="yellow"/>
+        </w:rPr>
         <w:t xml:space="preserve">- </w:t>
       </w:r>
       <w:r>
+        <w:rPr>
+          <w:highlight w:val="yellow"/>
+        </w:rPr>
         <w:tab/>
         <w:t>Generar el diagrama conceptual correspondiente.</w:t>
       </w:r>
@@ -5219,11 +5322,20 @@
         <w:spacing w:before="13" w:line="240" w:lineRule="auto"/>
         <w:ind w:left="367"/>
         <w:jc w:val="both"/>
-      </w:pPr>
-      <w:r>
+        <w:rPr>
+          <w:highlight w:val="yellow"/>
+        </w:rPr>
+      </w:pPr>
+      <w:r>
+        <w:rPr>
+          <w:highlight w:val="yellow"/>
+        </w:rPr>
         <w:t xml:space="preserve">-  </w:t>
       </w:r>
       <w:r>
+        <w:rPr>
+          <w:highlight w:val="yellow"/>
+        </w:rPr>
         <w:tab/>
         <w:t>Generar el DER ligado al diagrama conceptual.</w:t>
       </w:r>
@@ -5234,6 +5346,9 @@
         <w:spacing w:before="13" w:line="240" w:lineRule="auto"/>
         <w:ind w:left="367"/>
         <w:jc w:val="both"/>
+        <w:rPr>
+          <w:highlight w:val="yellow"/>
+        </w:rPr>
       </w:pPr>
     </w:p>
     <w:p>
@@ -5243,6 +5358,7 @@
         <w:spacing w:before="13" w:line="240" w:lineRule="auto"/>
         <w:jc w:val="both"/>
         <w:rPr>
+          <w:highlight w:val="yellow"/>
           <w:u w:val="single"/>
         </w:rPr>
       </w:pPr>
@@ -5250,6 +5366,7 @@
       <w:bookmarkEnd w:id="9"/>
       <w:r>
         <w:rPr>
+          <w:highlight w:val="yellow"/>
           <w:u w:val="single"/>
         </w:rPr>
         <w:t>Actividad 04.1</w:t>
@@ -5261,6 +5378,9 @@
           <w:ilvl w:val="0"/>
           <w:numId w:val="1"/>
         </w:numPr>
+        <w:rPr>
+          <w:highlight w:val="yellow"/>
+        </w:rPr>
       </w:pPr>
     </w:p>
     <w:p>
@@ -5269,6 +5389,9 @@
         <w:spacing w:before="13" w:line="240" w:lineRule="auto"/>
         <w:ind w:left="367"/>
         <w:jc w:val="both"/>
+        <w:rPr>
+          <w:highlight w:val="yellow"/>
+        </w:rPr>
       </w:pPr>
     </w:p>
     <w:p>
@@ -5278,6 +5401,7 @@
         <w:spacing w:before="13" w:line="240" w:lineRule="auto"/>
         <w:jc w:val="both"/>
         <w:rPr>
+          <w:highlight w:val="yellow"/>
           <w:u w:val="single"/>
         </w:rPr>
       </w:pPr>
@@ -5285,6 +5409,7 @@
       <w:bookmarkEnd w:id="10"/>
       <w:r>
         <w:rPr>
+          <w:highlight w:val="yellow"/>
           <w:u w:val="single"/>
         </w:rPr>
         <w:t>Actividad 04.2</w:t>
@@ -5295,6 +5420,9 @@
         <w:widowControl w:val="0"/>
         <w:spacing w:before="13" w:line="240" w:lineRule="auto"/>
         <w:ind w:left="367"/>
+        <w:rPr>
+          <w:highlight w:val="yellow"/>
+        </w:rPr>
       </w:pPr>
     </w:p>
     <w:p>
@@ -5305,16 +5433,28 @@
           <w:numId w:val="2"/>
         </w:numPr>
         <w:spacing w:before="13" w:line="240" w:lineRule="auto"/>
-      </w:pPr>
-      <w:r>
+        <w:rPr>
+          <w:highlight w:val="yellow"/>
+        </w:rPr>
+      </w:pPr>
+      <w:r>
+        <w:rPr>
+          <w:highlight w:val="yellow"/>
+        </w:rPr>
         <w:t xml:space="preserve">Realizar el DER de Farmacia </w:t>
       </w:r>
       <w:proofErr w:type="gramStart"/>
       <w:r>
+        <w:rPr>
+          <w:highlight w:val="yellow"/>
+        </w:rPr>
         <w:t>( Actividad</w:t>
       </w:r>
       <w:proofErr w:type="gramEnd"/>
       <w:r>
+        <w:rPr>
+          <w:highlight w:val="yellow"/>
+        </w:rPr>
         <w:t xml:space="preserve"> 2 - Enunciado 2)</w:t>
       </w:r>
     </w:p>
@@ -5342,6 +5482,7 @@
         <w:widowControl w:val="0"/>
         <w:spacing w:before="13" w:line="240" w:lineRule="auto"/>
         <w:rPr>
+          <w:highlight w:val="yellow"/>
           <w:u w:val="single"/>
         </w:rPr>
       </w:pPr>
@@ -5349,6 +5490,7 @@
       <w:bookmarkEnd w:id="11"/>
       <w:r>
         <w:rPr>
+          <w:highlight w:val="yellow"/>
           <w:u w:val="single"/>
         </w:rPr>
         <w:t>Actividad 05</w:t>
@@ -5358,6 +5500,9 @@
       <w:pPr>
         <w:widowControl w:val="0"/>
         <w:spacing w:before="13" w:line="240" w:lineRule="auto"/>
+        <w:rPr>
+          <w:highlight w:val="yellow"/>
+        </w:rPr>
       </w:pPr>
     </w:p>
     <w:p>
@@ -5368,15 +5513,20 @@
         <w:rPr>
           <w:b/>
           <w:bCs/>
-        </w:rPr>
-      </w:pPr>
-      <w:r>
+          <w:highlight w:val="yellow"/>
+        </w:rPr>
+      </w:pPr>
+      <w:r>
+        <w:rPr>
+          <w:highlight w:val="yellow"/>
+        </w:rPr>
         <w:t xml:space="preserve">Para realizar la presente actividad, deberán leer el apunte </w:t>
       </w:r>
       <w:r>
         <w:rPr>
           <w:b/>
           <w:bCs/>
+          <w:highlight w:val="yellow"/>
         </w:rPr>
         <w:t>“2 - Modelo Entidad-Relación.</w:t>
       </w:r>
@@ -5386,15 +5536,22 @@
         <w:widowControl w:val="0"/>
         <w:spacing w:before="13" w:line="240" w:lineRule="auto"/>
         <w:jc w:val="both"/>
+        <w:rPr>
+          <w:highlight w:val="yellow"/>
+        </w:rPr>
       </w:pPr>
       <w:r>
         <w:rPr>
           <w:b/>
           <w:bCs/>
+          <w:highlight w:val="yellow"/>
         </w:rPr>
         <w:t>Diagrama Entidad Relación”</w:t>
       </w:r>
       <w:r>
+        <w:rPr>
+          <w:highlight w:val="yellow"/>
+        </w:rPr>
         <w:t>.</w:t>
       </w:r>
     </w:p>
@@ -5403,6 +5560,9 @@
         <w:widowControl w:val="0"/>
         <w:spacing w:before="13" w:line="240" w:lineRule="auto"/>
         <w:jc w:val="both"/>
+        <w:rPr>
+          <w:highlight w:val="yellow"/>
+        </w:rPr>
       </w:pPr>
     </w:p>
     <w:p>
@@ -5413,15 +5573,20 @@
         <w:rPr>
           <w:b/>
           <w:bCs/>
-        </w:rPr>
-      </w:pPr>
-      <w:r>
+          <w:highlight w:val="yellow"/>
+        </w:rPr>
+      </w:pPr>
+      <w:r>
+        <w:rPr>
+          <w:highlight w:val="yellow"/>
+        </w:rPr>
         <w:t>Se pide realizar los diagramas de entidad-relación para el</w:t>
       </w:r>
       <w:r>
         <w:rPr>
           <w:b/>
           <w:bCs/>
+          <w:highlight w:val="yellow"/>
         </w:rPr>
         <w:t xml:space="preserve"> enunciado 2 de la actividad 02</w:t>
       </w:r>
@@ -5431,25 +5596,36 @@
         <w:widowControl w:val="0"/>
         <w:spacing w:before="13" w:line="240" w:lineRule="auto"/>
         <w:jc w:val="both"/>
+        <w:rPr>
+          <w:highlight w:val="yellow"/>
+        </w:rPr>
       </w:pPr>
       <w:r>
         <w:rPr>
           <w:b/>
           <w:bCs/>
+          <w:highlight w:val="yellow"/>
         </w:rPr>
         <w:t xml:space="preserve">(farmacia) </w:t>
       </w:r>
       <w:r>
+        <w:rPr>
+          <w:highlight w:val="yellow"/>
+        </w:rPr>
         <w:t>y para el</w:t>
       </w:r>
       <w:r>
         <w:rPr>
           <w:b/>
           <w:bCs/>
+          <w:highlight w:val="yellow"/>
         </w:rPr>
         <w:t xml:space="preserve"> enunciado de la actividad 04 (aerolínea)</w:t>
       </w:r>
       <w:r>
+        <w:rPr>
+          <w:highlight w:val="yellow"/>
+        </w:rPr>
         <w:t>, a partir de los DC realizados</w:t>
       </w:r>
     </w:p>
@@ -5458,8 +5634,14 @@
         <w:widowControl w:val="0"/>
         <w:spacing w:before="13" w:line="240" w:lineRule="auto"/>
         <w:jc w:val="both"/>
-      </w:pPr>
-      <w:r>
+        <w:rPr>
+          <w:highlight w:val="yellow"/>
+        </w:rPr>
+      </w:pPr>
+      <w:r>
+        <w:rPr>
+          <w:highlight w:val="yellow"/>
+        </w:rPr>
         <w:t>durante la cursada.</w:t>
       </w:r>
     </w:p>
@@ -5468,6 +5650,9 @@
         <w:widowControl w:val="0"/>
         <w:spacing w:before="13" w:line="240" w:lineRule="auto"/>
         <w:jc w:val="both"/>
+        <w:rPr>
+          <w:highlight w:val="yellow"/>
+        </w:rPr>
       </w:pPr>
     </w:p>
     <w:p>
@@ -5481,6 +5666,9 @@
         </w:rPr>
       </w:pPr>
       <w:r>
+        <w:rPr>
+          <w:highlight w:val="yellow"/>
+        </w:rPr>
         <w:t xml:space="preserve">La entrega se realizará en formato </w:t>
       </w:r>
       <w:proofErr w:type="spellStart"/>
@@ -5488,6 +5676,7 @@
         <w:rPr>
           <w:b/>
           <w:bCs/>
+          <w:highlight w:val="yellow"/>
         </w:rPr>
         <w:t>mwb</w:t>
       </w:r>
@@ -5496,6 +5685,7 @@
         <w:rPr>
           <w:b/>
           <w:bCs/>
+          <w:highlight w:val="yellow"/>
         </w:rPr>
         <w:t xml:space="preserve"> (Archivo de modelo de </w:t>
       </w:r>
@@ -5504,6 +5694,7 @@
         <w:rPr>
           <w:b/>
           <w:bCs/>
+          <w:highlight w:val="yellow"/>
         </w:rPr>
         <w:t>Mysql</w:t>
       </w:r>
@@ -5512,6 +5703,7 @@
         <w:rPr>
           <w:b/>
           <w:bCs/>
+          <w:highlight w:val="yellow"/>
         </w:rPr>
         <w:t xml:space="preserve"> </w:t>
       </w:r>
@@ -5520,6 +5712,7 @@
         <w:rPr>
           <w:b/>
           <w:bCs/>
+          <w:highlight w:val="yellow"/>
         </w:rPr>
         <w:t>Workbench</w:t>
       </w:r>
@@ -5528,6 +5721,7 @@
         <w:rPr>
           <w:b/>
           <w:bCs/>
+          <w:highlight w:val="yellow"/>
         </w:rPr>
         <w:t>).</w:t>
       </w:r>
@@ -5550,6 +5744,7 @@
         <w:spacing w:before="13" w:line="240" w:lineRule="auto"/>
         <w:jc w:val="both"/>
         <w:rPr>
+          <w:highlight w:val="yellow"/>
           <w:u w:val="single"/>
         </w:rPr>
       </w:pPr>
@@ -5557,6 +5752,7 @@
       <w:bookmarkEnd w:id="12"/>
       <w:r>
         <w:rPr>
+          <w:highlight w:val="yellow"/>
           <w:u w:val="single"/>
         </w:rPr>
         <w:t>Actividad 05.1</w:t>
@@ -5570,23 +5766,36 @@
         <w:rPr>
           <w:b/>
           <w:bCs/>
-        </w:rPr>
-      </w:pPr>
-    </w:p>
-    <w:p>
-      <w:pPr>
-        <w:jc w:val="both"/>
-      </w:pPr>
-      <w:r>
+          <w:highlight w:val="yellow"/>
+        </w:rPr>
+      </w:pPr>
+    </w:p>
+    <w:p>
+      <w:pPr>
+        <w:jc w:val="both"/>
+      </w:pPr>
+      <w:r>
+        <w:rPr>
+          <w:highlight w:val="yellow"/>
+        </w:rPr>
         <w:t xml:space="preserve">Para el enunciado de la actividad 04 (aerolínea), en </w:t>
       </w:r>
       <w:proofErr w:type="spellStart"/>
       <w:r>
+        <w:rPr>
+          <w:highlight w:val="yellow"/>
+        </w:rPr>
         <w:t>en</w:t>
       </w:r>
       <w:proofErr w:type="spellEnd"/>
       <w:r>
-        <w:t xml:space="preserve"> base al DER subido en la tarea anterior (Actividad 5), crear la BD desde código fuente con la sintaxis sencilla vista en clase, pueden ayudarse con la sintaxis automática, pero deben entregarlo con el formato que vimos en clase (sencillo, con las FK creadas a mano, luego de los constructores de las tablas). </w:t>
+        <w:rPr>
+          <w:highlight w:val="yellow"/>
+        </w:rPr>
+        <w:t xml:space="preserve"> base al DER subido en la tarea anterior (Actividad 5), crear la BD desde código fuente con la sintaxis sencilla vista en clase, pueden ayudarse con la sintaxis automática, pero deben entregarlo con el formato que vimos en clase (sencillo, con las FK creadas a mano, luego de los constructores de las tablas).</w:t>
+      </w:r>
+      <w:r>
+        <w:t xml:space="preserve"> </w:t>
       </w:r>
     </w:p>
     <w:p>
@@ -7191,7 +7400,7 @@
       </w:pPr>
     </w:p>
     <w:sectPr>
-      <w:footerReference w:type="default" r:id="rId12"/>
+      <w:footerReference w:type="default" r:id="rId11"/>
       <w:pgSz w:w="11920" w:h="16860"/>
       <w:pgMar w:top="1431" w:right="930" w:bottom="1832" w:left="1441" w:header="0" w:footer="720" w:gutter="0"/>
       <w:pgNumType w:start="1"/>

</xml_diff>